<commit_message>
export docx draft contract 1
</commit_message>
<xml_diff>
--- a/docs/Template_contract (1).docx
+++ b/docs/Template_contract (1).docx
@@ -130,7 +130,7 @@
           <w:szCs w:val="25"/>
           <w:rtl w:val="0"/>
         </w:rPr>
-        <w:t xml:space="preserve">Số: 1417-SUN/HĐTN-2026</w:t>
+        <w:t xml:space="preserve">Số: ${contractCode}</w:t>
       </w:r>
       <w:r>
         <w:rPr>
@@ -248,45 +248,45 @@
           <w:szCs w:val="25"/>
           <w:rtl w:val="0"/>
         </w:rPr>
-        <w:t xml:space="preserve">Hôm nay, ngày …  tháng … năm </w:t>
-      </w:r>
-      <w:r>
-        <w:rPr>
-          <w:rFonts w:ascii="Times New Roman" w:cs="Times New Roman" w:eastAsia="Times New Roman" w:hAnsi="Times New Roman"/>
-          <w:sz w:val="25"/>
-          <w:szCs w:val="25"/>
-          <w:rtl w:val="0"/>
-        </w:rPr>
-        <w:t xml:space="preserve">……</w:t>
-      </w:r>
-      <w:r>
-        <w:rPr>
-          <w:rFonts w:ascii="Times New Roman" w:cs="Times New Roman" w:eastAsia="Times New Roman" w:hAnsi="Times New Roman"/>
-          <w:color w:val="000000"/>
-          <w:sz w:val="25"/>
-          <w:szCs w:val="25"/>
-          <w:rtl w:val="0"/>
-        </w:rPr>
-        <w:t xml:space="preserve">, tại </w:t>
-      </w:r>
-      <w:r>
-        <w:rPr>
-          <w:rFonts w:ascii="Times New Roman" w:cs="Times New Roman" w:eastAsia="Times New Roman" w:hAnsi="Times New Roman"/>
-          <w:sz w:val="25"/>
-          <w:szCs w:val="25"/>
-          <w:rtl w:val="0"/>
-        </w:rPr>
-        <w:t xml:space="preserve">……………………….</w:t>
-      </w:r>
-      <w:r>
-        <w:rPr>
-          <w:rFonts w:ascii="Times New Roman" w:cs="Times New Roman" w:eastAsia="Times New Roman" w:hAnsi="Times New Roman"/>
-          <w:color w:val="000000"/>
-          <w:sz w:val="25"/>
-          <w:szCs w:val="25"/>
-          <w:rtl w:val="0"/>
-        </w:rPr>
-        <w:t xml:space="preserve">, chúng tôi gồm:</w:t>
+        <w:t xml:space="preserve">Hôm nay, ngày ${signDay} tháng ${signMonth} năm ${signYear}, tại ${signPlace}, chúng tôi gồm:</w:t>
+      </w:r>
+      <w:r>
+        <w:rPr>
+          <w:rFonts w:ascii="Times New Roman" w:cs="Times New Roman" w:eastAsia="Times New Roman" w:hAnsi="Times New Roman"/>
+          <w:sz w:val="25"/>
+          <w:szCs w:val="25"/>
+          <w:rtl w:val="0"/>
+        </w:rPr>
+        <w:t xml:space="preserve"/>
+      </w:r>
+      <w:r>
+        <w:rPr>
+          <w:rFonts w:ascii="Times New Roman" w:cs="Times New Roman" w:eastAsia="Times New Roman" w:hAnsi="Times New Roman"/>
+          <w:color w:val="000000"/>
+          <w:sz w:val="25"/>
+          <w:szCs w:val="25"/>
+          <w:rtl w:val="0"/>
+        </w:rPr>
+        <w:t xml:space="preserve"/>
+      </w:r>
+      <w:r>
+        <w:rPr>
+          <w:rFonts w:ascii="Times New Roman" w:cs="Times New Roman" w:eastAsia="Times New Roman" w:hAnsi="Times New Roman"/>
+          <w:sz w:val="25"/>
+          <w:szCs w:val="25"/>
+          <w:rtl w:val="0"/>
+        </w:rPr>
+        <w:t xml:space="preserve"/>
+      </w:r>
+      <w:r>
+        <w:rPr>
+          <w:rFonts w:ascii="Times New Roman" w:cs="Times New Roman" w:eastAsia="Times New Roman" w:hAnsi="Times New Roman"/>
+          <w:color w:val="000000"/>
+          <w:sz w:val="25"/>
+          <w:szCs w:val="25"/>
+          <w:rtl w:val="0"/>
+        </w:rPr>
+        <w:t xml:space="preserve"/>
       </w:r>
     </w:p>
     <w:p>
@@ -443,7 +443,7 @@
           <w:szCs w:val="25"/>
           <w:rtl w:val="0"/>
         </w:rPr>
-        <w:t xml:space="preserve">………………………………………..</w:t>
+        <w:t xml:space="preserve"/>
       </w:r>
       <w:r>
         <w:rPr>
@@ -571,18 +571,18 @@
           <w:szCs w:val="25"/>
           <w:rtl w:val="0"/>
         </w:rPr>
-        <w:t xml:space="preserve">Ông/bà: </w:t>
-      </w:r>
-      <w:r>
-        <w:rPr>
-          <w:rFonts w:ascii="Times New Roman" w:cs="Times New Roman" w:eastAsia="Times New Roman" w:hAnsi="Times New Roman"/>
-          <w:b w:val="1"/>
-          <w:bCs w:val="1"/>
-          <w:sz w:val="25"/>
-          <w:szCs w:val="25"/>
-          <w:rtl w:val="0"/>
-        </w:rPr>
-        <w:t xml:space="preserve">.....................................................................................</w:t>
+        <w:t xml:space="preserve">Ông/bà: ${tenantFullName}</w:t>
+      </w:r>
+      <w:r>
+        <w:rPr>
+          <w:rFonts w:ascii="Times New Roman" w:cs="Times New Roman" w:eastAsia="Times New Roman" w:hAnsi="Times New Roman"/>
+          <w:b w:val="1"/>
+          <w:bCs w:val="1"/>
+          <w:sz w:val="25"/>
+          <w:szCs w:val="25"/>
+          <w:rtl w:val="0"/>
+        </w:rPr>
+        <w:t xml:space="preserve"/>
       </w:r>
       <w:r>
         <w:rPr>
@@ -618,7 +618,7 @@
           <w:szCs w:val="25"/>
           <w:rtl w:val="0"/>
         </w:rPr>
-        <w:t xml:space="preserve">Số </w:t>
+        <w:t xml:space="preserve"/>
       </w:r>
       <w:r>
         <w:rPr>
@@ -630,16 +630,16 @@
           <w:szCs w:val="25"/>
           <w:rtl w:val="0"/>
         </w:rPr>
-        <w:t xml:space="preserve">CCCD:</w:t>
-      </w:r>
-      <w:r>
-        <w:rPr>
-          <w:rFonts w:ascii="Times New Roman" w:cs="Times New Roman" w:eastAsia="Times New Roman" w:hAnsi="Times New Roman"/>
-          <w:sz w:val="25"/>
-          <w:szCs w:val="25"/>
-          <w:rtl w:val="0"/>
-        </w:rPr>
-        <w:t xml:space="preserve">................................</w:t>
+        <w:t xml:space="preserve">Số CCCD: ${tenantCccd}</w:t>
+      </w:r>
+      <w:r>
+        <w:rPr>
+          <w:rFonts w:ascii="Times New Roman" w:cs="Times New Roman" w:eastAsia="Times New Roman" w:hAnsi="Times New Roman"/>
+          <w:sz w:val="25"/>
+          <w:szCs w:val="25"/>
+          <w:rtl w:val="0"/>
+        </w:rPr>
+        <w:t xml:space="preserve"/>
       </w:r>
       <w:r>
         <w:rPr>
@@ -651,16 +651,16 @@
           <w:szCs w:val="25"/>
           <w:rtl w:val="0"/>
         </w:rPr>
-        <w:t xml:space="preserve">  Cấp ngày: </w:t>
-      </w:r>
-      <w:r>
-        <w:rPr>
-          <w:rFonts w:ascii="Times New Roman" w:cs="Times New Roman" w:eastAsia="Times New Roman" w:hAnsi="Times New Roman"/>
-          <w:sz w:val="25"/>
-          <w:szCs w:val="25"/>
-          <w:rtl w:val="0"/>
-        </w:rPr>
-        <w:t xml:space="preserve">…………………</w:t>
+        <w:t xml:space="preserve">Ngày sinh: ${tenantDob}</w:t>
+      </w:r>
+      <w:r>
+        <w:rPr>
+          <w:rFonts w:ascii="Times New Roman" w:cs="Times New Roman" w:eastAsia="Times New Roman" w:hAnsi="Times New Roman"/>
+          <w:sz w:val="25"/>
+          <w:szCs w:val="25"/>
+          <w:rtl w:val="0"/>
+        </w:rPr>
+        <w:t xml:space="preserve"/>
       </w:r>
       <w:r>
         <w:rPr>
@@ -672,16 +672,16 @@
           <w:szCs w:val="25"/>
           <w:rtl w:val="0"/>
         </w:rPr>
-        <w:t xml:space="preserve">  Nơi cấp: </w:t>
-      </w:r>
-      <w:r>
-        <w:rPr>
-          <w:rFonts w:ascii="Times New Roman" w:cs="Times New Roman" w:eastAsia="Times New Roman" w:hAnsi="Times New Roman"/>
-          <w:sz w:val="25"/>
-          <w:szCs w:val="25"/>
-          <w:rtl w:val="0"/>
-        </w:rPr>
-        <w:t xml:space="preserve">………………..</w:t>
+        <w:t xml:space="preserve"/>
+      </w:r>
+      <w:r>
+        <w:rPr>
+          <w:rFonts w:ascii="Times New Roman" w:cs="Times New Roman" w:eastAsia="Times New Roman" w:hAnsi="Times New Roman"/>
+          <w:sz w:val="25"/>
+          <w:szCs w:val="25"/>
+          <w:rtl w:val="0"/>
+        </w:rPr>
+        <w:t xml:space="preserve"/>
       </w:r>
       <w:r>
         <w:rPr>
@@ -712,119 +712,119 @@
           <w:szCs w:val="25"/>
           <w:rtl w:val="0"/>
         </w:rPr>
-        <w:t xml:space="preserve">HKTT: </w:t>
-      </w:r>
-      <w:r>
-        <w:rPr>
-          <w:rFonts w:ascii="Times New Roman" w:cs="Times New Roman" w:eastAsia="Times New Roman" w:hAnsi="Times New Roman"/>
-          <w:sz w:val="25"/>
-          <w:szCs w:val="25"/>
-          <w:rtl w:val="0"/>
-        </w:rPr>
-        <w:t xml:space="preserve">……………………………………………………………..</w:t>
-      </w:r>
-      <w:r>
-        <w:rPr>
-          <w:rtl w:val="0"/>
-        </w:rPr>
-      </w:r>
-    </w:p>
-    <w:p>
-      <w:pPr>
-        <w:shd w:fill="ffffff" w:val="clear"/>
-        <w:spacing w:after="0" w:line="240" w:lineRule="auto"/>
-        <w:rPr>
-          <w:rFonts w:ascii="Times New Roman" w:cs="Times New Roman" w:eastAsia="Times New Roman" w:hAnsi="Times New Roman"/>
-          <w:color w:val="000000"/>
-          <w:sz w:val="25"/>
-          <w:szCs w:val="25"/>
-        </w:rPr>
-      </w:pPr>
-      <w:r>
-        <w:rPr>
-          <w:rFonts w:ascii="Times New Roman" w:cs="Times New Roman" w:eastAsia="Times New Roman" w:hAnsi="Times New Roman"/>
-          <w:color w:val="000000"/>
-          <w:sz w:val="25"/>
-          <w:szCs w:val="25"/>
-          <w:rtl w:val="0"/>
-        </w:rPr>
-        <w:t xml:space="preserve">Điện thoại: ……………..……………</w:t>
-      </w:r>
-    </w:p>
-    <w:p>
-      <w:pPr>
-        <w:shd w:fill="ffffff" w:val="clear"/>
-        <w:spacing w:after="0" w:line="240" w:lineRule="auto"/>
-        <w:rPr>
-          <w:rFonts w:ascii="Times New Roman" w:cs="Times New Roman" w:eastAsia="Times New Roman" w:hAnsi="Times New Roman"/>
-          <w:color w:val="000000"/>
-          <w:sz w:val="25"/>
-          <w:szCs w:val="25"/>
-        </w:rPr>
-      </w:pPr>
-      <w:r>
-        <w:rPr>
-          <w:rtl w:val="0"/>
-        </w:rPr>
-      </w:r>
-    </w:p>
-    <w:p>
-      <w:pPr>
-        <w:shd w:fill="ffffff" w:val="clear"/>
-        <w:spacing w:after="0" w:line="240" w:lineRule="auto"/>
-        <w:rPr>
-          <w:rFonts w:ascii="Times New Roman" w:cs="Times New Roman" w:eastAsia="Times New Roman" w:hAnsi="Times New Roman"/>
-          <w:color w:val="000000"/>
-          <w:sz w:val="25"/>
-          <w:szCs w:val="25"/>
-        </w:rPr>
-      </w:pPr>
-      <w:r>
-        <w:rPr>
-          <w:rFonts w:ascii="Times New Roman" w:cs="Times New Roman" w:eastAsia="Times New Roman" w:hAnsi="Times New Roman"/>
-          <w:color w:val="000000"/>
-          <w:sz w:val="25"/>
-          <w:szCs w:val="25"/>
-          <w:rtl w:val="0"/>
-        </w:rPr>
-        <w:t xml:space="preserve">Người ở cùng</w:t>
-      </w:r>
-    </w:p>
-    <w:p>
-      <w:pPr>
-        <w:shd w:fill="ffffff" w:val="clear"/>
-        <w:spacing w:after="0" w:line="240" w:lineRule="auto"/>
-        <w:rPr>
-          <w:rFonts w:ascii="Times New Roman" w:cs="Times New Roman" w:eastAsia="Times New Roman" w:hAnsi="Times New Roman"/>
-          <w:b w:val="1"/>
-          <w:bCs w:val="1"/>
-          <w:color w:val="000000"/>
-          <w:sz w:val="25"/>
-          <w:szCs w:val="25"/>
-        </w:rPr>
-      </w:pPr>
-      <w:r>
-        <w:rPr>
-          <w:rFonts w:ascii="Times New Roman" w:cs="Times New Roman" w:eastAsia="Times New Roman" w:hAnsi="Times New Roman"/>
-          <w:b w:val="1"/>
-          <w:bCs w:val="1"/>
-          <w:color w:val="000000"/>
-          <w:sz w:val="25"/>
-          <w:szCs w:val="25"/>
-          <w:rtl w:val="0"/>
-        </w:rPr>
-        <w:t xml:space="preserve">Ông/bà: </w:t>
-      </w:r>
-      <w:r>
-        <w:rPr>
-          <w:rFonts w:ascii="Times New Roman" w:cs="Times New Roman" w:eastAsia="Times New Roman" w:hAnsi="Times New Roman"/>
-          <w:b w:val="1"/>
-          <w:bCs w:val="1"/>
-          <w:sz w:val="25"/>
-          <w:szCs w:val="25"/>
-          <w:rtl w:val="0"/>
-        </w:rPr>
-        <w:t xml:space="preserve">..............................................................................</w:t>
+        <w:t xml:space="preserve">HKTT: ${tenantAddress}</w:t>
+      </w:r>
+      <w:r>
+        <w:rPr>
+          <w:rFonts w:ascii="Times New Roman" w:cs="Times New Roman" w:eastAsia="Times New Roman" w:hAnsi="Times New Roman"/>
+          <w:sz w:val="25"/>
+          <w:szCs w:val="25"/>
+          <w:rtl w:val="0"/>
+        </w:rPr>
+        <w:t xml:space="preserve"/>
+      </w:r>
+      <w:r>
+        <w:rPr>
+          <w:rtl w:val="0"/>
+        </w:rPr>
+      </w:r>
+    </w:p>
+    <w:p>
+      <w:pPr>
+        <w:shd w:fill="ffffff" w:val="clear"/>
+        <w:spacing w:after="0" w:line="240" w:lineRule="auto"/>
+        <w:rPr>
+          <w:rFonts w:ascii="Times New Roman" w:cs="Times New Roman" w:eastAsia="Times New Roman" w:hAnsi="Times New Roman"/>
+          <w:color w:val="000000"/>
+          <w:sz w:val="25"/>
+          <w:szCs w:val="25"/>
+        </w:rPr>
+      </w:pPr>
+      <w:r>
+        <w:rPr>
+          <w:rFonts w:ascii="Times New Roman" w:cs="Times New Roman" w:eastAsia="Times New Roman" w:hAnsi="Times New Roman"/>
+          <w:color w:val="000000"/>
+          <w:sz w:val="25"/>
+          <w:szCs w:val="25"/>
+          <w:rtl w:val="0"/>
+        </w:rPr>
+        <w:t xml:space="preserve">Điện thoại: ${tenantPhone}</w:t>
+      </w:r>
+    </w:p>
+    <w:p>
+      <w:pPr>
+        <w:shd w:fill="ffffff" w:val="clear"/>
+        <w:spacing w:after="0" w:line="240" w:lineRule="auto"/>
+        <w:rPr>
+          <w:rFonts w:ascii="Times New Roman" w:cs="Times New Roman" w:eastAsia="Times New Roman" w:hAnsi="Times New Roman"/>
+          <w:color w:val="000000"/>
+          <w:sz w:val="25"/>
+          <w:szCs w:val="25"/>
+        </w:rPr>
+      </w:pPr>
+      <w:r>
+        <w:rPr>
+          <w:rtl w:val="0"/>
+        </w:rPr>
+      </w:r>
+    </w:p>
+    <w:p>
+      <w:pPr>
+        <w:shd w:fill="ffffff" w:val="clear"/>
+        <w:spacing w:after="0" w:line="240" w:lineRule="auto"/>
+        <w:rPr>
+          <w:rFonts w:ascii="Times New Roman" w:cs="Times New Roman" w:eastAsia="Times New Roman" w:hAnsi="Times New Roman"/>
+          <w:color w:val="000000"/>
+          <w:sz w:val="25"/>
+          <w:szCs w:val="25"/>
+        </w:rPr>
+      </w:pPr>
+      <w:r>
+        <w:rPr>
+          <w:rFonts w:ascii="Times New Roman" w:cs="Times New Roman" w:eastAsia="Times New Roman" w:hAnsi="Times New Roman"/>
+          <w:color w:val="000000"/>
+          <w:sz w:val="25"/>
+          <w:szCs w:val="25"/>
+          <w:rtl w:val="0"/>
+        </w:rPr>
+        <w:t xml:space="preserve">Người ở cùng: ${householdMembers}</w:t>
+      </w:r>
+    </w:p>
+    <w:p>
+      <w:pPr>
+        <w:shd w:fill="ffffff" w:val="clear"/>
+        <w:spacing w:after="0" w:line="240" w:lineRule="auto"/>
+        <w:rPr>
+          <w:rFonts w:ascii="Times New Roman" w:cs="Times New Roman" w:eastAsia="Times New Roman" w:hAnsi="Times New Roman"/>
+          <w:b w:val="1"/>
+          <w:bCs w:val="1"/>
+          <w:color w:val="000000"/>
+          <w:sz w:val="25"/>
+          <w:szCs w:val="25"/>
+        </w:rPr>
+      </w:pPr>
+      <w:r>
+        <w:rPr>
+          <w:rFonts w:ascii="Times New Roman" w:cs="Times New Roman" w:eastAsia="Times New Roman" w:hAnsi="Times New Roman"/>
+          <w:b w:val="1"/>
+          <w:bCs w:val="1"/>
+          <w:color w:val="000000"/>
+          <w:sz w:val="25"/>
+          <w:szCs w:val="25"/>
+          <w:rtl w:val="0"/>
+        </w:rPr>
+        <w:t xml:space="preserve"/>
+      </w:r>
+      <w:r>
+        <w:rPr>
+          <w:rFonts w:ascii="Times New Roman" w:cs="Times New Roman" w:eastAsia="Times New Roman" w:hAnsi="Times New Roman"/>
+          <w:b w:val="1"/>
+          <w:bCs w:val="1"/>
+          <w:sz w:val="25"/>
+          <w:szCs w:val="25"/>
+          <w:rtl w:val="0"/>
+        </w:rPr>
+        <w:t xml:space="preserve"/>
       </w:r>
       <w:r>
         <w:rPr>
@@ -853,7 +853,7 @@
           <w:szCs w:val="25"/>
           <w:rtl w:val="0"/>
         </w:rPr>
-        <w:t xml:space="preserve">Số </w:t>
+        <w:t xml:space="preserve"/>
       </w:r>
       <w:r>
         <w:rPr>
@@ -865,16 +865,16 @@
           <w:szCs w:val="25"/>
           <w:rtl w:val="0"/>
         </w:rPr>
-        <w:t xml:space="preserve">CCCD:</w:t>
-      </w:r>
-      <w:r>
-        <w:rPr>
-          <w:rFonts w:ascii="Times New Roman" w:cs="Times New Roman" w:eastAsia="Times New Roman" w:hAnsi="Times New Roman"/>
-          <w:sz w:val="25"/>
-          <w:szCs w:val="25"/>
-          <w:rtl w:val="0"/>
-        </w:rPr>
-        <w:t xml:space="preserve">........................................</w:t>
+        <w:t xml:space="preserve"/>
+      </w:r>
+      <w:r>
+        <w:rPr>
+          <w:rFonts w:ascii="Times New Roman" w:cs="Times New Roman" w:eastAsia="Times New Roman" w:hAnsi="Times New Roman"/>
+          <w:sz w:val="25"/>
+          <w:szCs w:val="25"/>
+          <w:rtl w:val="0"/>
+        </w:rPr>
+        <w:t xml:space="preserve"/>
       </w:r>
       <w:r>
         <w:rPr>
@@ -886,16 +886,16 @@
           <w:szCs w:val="25"/>
           <w:rtl w:val="0"/>
         </w:rPr>
-        <w:t xml:space="preserve">  Cấp ngày: …………….  Nơi cấp: </w:t>
-      </w:r>
-      <w:r>
-        <w:rPr>
-          <w:rFonts w:ascii="Times New Roman" w:cs="Times New Roman" w:eastAsia="Times New Roman" w:hAnsi="Times New Roman"/>
-          <w:sz w:val="25"/>
-          <w:szCs w:val="25"/>
-          <w:rtl w:val="0"/>
-        </w:rPr>
-        <w:t xml:space="preserve">……………...</w:t>
+        <w:t xml:space="preserve"/>
+      </w:r>
+      <w:r>
+        <w:rPr>
+          <w:rFonts w:ascii="Times New Roman" w:cs="Times New Roman" w:eastAsia="Times New Roman" w:hAnsi="Times New Roman"/>
+          <w:sz w:val="25"/>
+          <w:szCs w:val="25"/>
+          <w:rtl w:val="0"/>
+        </w:rPr>
+        <w:t xml:space="preserve"/>
       </w:r>
       <w:r>
         <w:rPr>
@@ -926,41 +926,41 @@
           <w:szCs w:val="25"/>
           <w:rtl w:val="0"/>
         </w:rPr>
-        <w:t xml:space="preserve">HKTT: </w:t>
-      </w:r>
-      <w:r>
-        <w:rPr>
-          <w:rFonts w:ascii="Times New Roman" w:cs="Times New Roman" w:eastAsia="Times New Roman" w:hAnsi="Times New Roman"/>
-          <w:sz w:val="25"/>
-          <w:szCs w:val="25"/>
-          <w:rtl w:val="0"/>
-        </w:rPr>
-        <w:t xml:space="preserve">……………………………………………………..</w:t>
-      </w:r>
-      <w:r>
-        <w:rPr>
-          <w:rtl w:val="0"/>
-        </w:rPr>
-      </w:r>
-    </w:p>
-    <w:p>
-      <w:pPr>
-        <w:shd w:fill="ffffff" w:val="clear"/>
-        <w:spacing w:after="0" w:line="240" w:lineRule="auto"/>
-        <w:rPr>
-          <w:rFonts w:ascii="Times New Roman" w:cs="Times New Roman" w:eastAsia="Times New Roman" w:hAnsi="Times New Roman"/>
-          <w:sz w:val="25"/>
-          <w:szCs w:val="25"/>
-        </w:rPr>
-      </w:pPr>
-      <w:r>
-        <w:rPr>
-          <w:rFonts w:ascii="Times New Roman" w:cs="Times New Roman" w:eastAsia="Times New Roman" w:hAnsi="Times New Roman"/>
-          <w:sz w:val="25"/>
-          <w:szCs w:val="25"/>
-          <w:rtl w:val="0"/>
-        </w:rPr>
-        <w:t xml:space="preserve">Điện thoại: ……………..……………</w:t>
+        <w:t xml:space="preserve"/>
+      </w:r>
+      <w:r>
+        <w:rPr>
+          <w:rFonts w:ascii="Times New Roman" w:cs="Times New Roman" w:eastAsia="Times New Roman" w:hAnsi="Times New Roman"/>
+          <w:sz w:val="25"/>
+          <w:szCs w:val="25"/>
+          <w:rtl w:val="0"/>
+        </w:rPr>
+        <w:t xml:space="preserve"/>
+      </w:r>
+      <w:r>
+        <w:rPr>
+          <w:rtl w:val="0"/>
+        </w:rPr>
+      </w:r>
+    </w:p>
+    <w:p>
+      <w:pPr>
+        <w:shd w:fill="ffffff" w:val="clear"/>
+        <w:spacing w:after="0" w:line="240" w:lineRule="auto"/>
+        <w:rPr>
+          <w:rFonts w:ascii="Times New Roman" w:cs="Times New Roman" w:eastAsia="Times New Roman" w:hAnsi="Times New Roman"/>
+          <w:sz w:val="25"/>
+          <w:szCs w:val="25"/>
+        </w:rPr>
+      </w:pPr>
+      <w:r>
+        <w:rPr>
+          <w:rFonts w:ascii="Times New Roman" w:cs="Times New Roman" w:eastAsia="Times New Roman" w:hAnsi="Times New Roman"/>
+          <w:sz w:val="25"/>
+          <w:szCs w:val="25"/>
+          <w:rtl w:val="0"/>
+        </w:rPr>
+        <w:t xml:space="preserve"/>
       </w:r>
     </w:p>
     <w:p>
@@ -1124,7 +1124,7 @@
           <w:vertAlign w:val="baseline"/>
           <w:rtl w:val="0"/>
         </w:rPr>
-        <w:t xml:space="preserve"> Bên A đồng ý cho thuê và bên B đồng ý thuê căn hộ chung cư số:</w:t>
+        <w:t xml:space="preserve">Bên A đồng ý cho thuê và bên B đồng ý thuê căn hộ: ${rentalUnit}</w:t>
         <w:br w:type="textWrapping"/>
       </w:r>
       <w:r>
@@ -1134,7 +1134,7 @@
           <w:szCs w:val="25"/>
           <w:rtl w:val="0"/>
         </w:rPr>
-        <w:t xml:space="preserve">………………………………………………</w:t>
+        <w:t xml:space="preserve"/>
       </w:r>
       <w:r>
         <w:rPr>
@@ -1195,7 +1195,7 @@
           <w:vertAlign w:val="baseline"/>
           <w:rtl w:val="0"/>
         </w:rPr>
-        <w:t xml:space="preserve">Tổng diện tích</w:t>
+        <w:t xml:space="preserve">Tổng diện tích: ${areaSize} m²</w:t>
       </w:r>
       <w:r>
         <w:rPr>
@@ -1214,16 +1214,16 @@
           <w:vertAlign w:val="baseline"/>
           <w:rtl w:val="0"/>
         </w:rPr>
-        <w:t xml:space="preserve">: </w:t>
-      </w:r>
-      <w:r>
-        <w:rPr>
-          <w:rFonts w:ascii="Times New Roman" w:cs="Times New Roman" w:eastAsia="Times New Roman" w:hAnsi="Times New Roman"/>
-          <w:sz w:val="25"/>
-          <w:szCs w:val="25"/>
-          <w:rtl w:val="0"/>
-        </w:rPr>
-        <w:t xml:space="preserve">……………………………….</w:t>
+        <w:t xml:space="preserve"/>
+      </w:r>
+      <w:r>
+        <w:rPr>
+          <w:rFonts w:ascii="Times New Roman" w:cs="Times New Roman" w:eastAsia="Times New Roman" w:hAnsi="Times New Roman"/>
+          <w:sz w:val="25"/>
+          <w:szCs w:val="25"/>
+          <w:rtl w:val="0"/>
+        </w:rPr>
+        <w:t xml:space="preserve"/>
       </w:r>
       <w:r>
         <w:rPr>
@@ -1339,76 +1339,76 @@
           <w:u w:val="single"/>
           <w:rtl w:val="0"/>
         </w:rPr>
-        <w:t xml:space="preserve">Điều 3</w:t>
-      </w:r>
-      <w:r>
-        <w:rPr>
-          <w:rFonts w:ascii="Times New Roman" w:cs="Times New Roman" w:eastAsia="Times New Roman" w:hAnsi="Times New Roman"/>
-          <w:b w:val="1"/>
-          <w:bCs w:val="1"/>
-          <w:color w:val="000000"/>
-          <w:sz w:val="25"/>
-          <w:szCs w:val="25"/>
-          <w:rtl w:val="0"/>
-        </w:rPr>
-        <w:t xml:space="preserve">: Thời hạn thuê</w:t>
-      </w:r>
-      <w:r>
-        <w:rPr>
-          <w:rFonts w:ascii="Times New Roman" w:cs="Times New Roman" w:eastAsia="Times New Roman" w:hAnsi="Times New Roman"/>
-          <w:color w:val="000000"/>
-          <w:sz w:val="25"/>
-          <w:szCs w:val="25"/>
-          <w:rtl w:val="0"/>
-        </w:rPr>
-        <w:t xml:space="preserve">: </w:t>
-      </w:r>
-      <w:r>
-        <w:rPr>
-          <w:rFonts w:ascii="Times New Roman" w:cs="Times New Roman" w:eastAsia="Times New Roman" w:hAnsi="Times New Roman"/>
-          <w:sz w:val="25"/>
-          <w:szCs w:val="25"/>
-          <w:rtl w:val="0"/>
-        </w:rPr>
-        <w:t xml:space="preserve">……..</w:t>
-      </w:r>
-      <w:r>
-        <w:rPr>
-          <w:rFonts w:ascii="Times New Roman" w:cs="Times New Roman" w:eastAsia="Times New Roman" w:hAnsi="Times New Roman"/>
-          <w:color w:val="000000"/>
-          <w:sz w:val="25"/>
-          <w:szCs w:val="25"/>
-          <w:rtl w:val="0"/>
-        </w:rPr>
-        <w:t xml:space="preserve"> năm tính từ ngày </w:t>
-      </w:r>
-      <w:r>
-        <w:rPr>
-          <w:rFonts w:ascii="Times New Roman" w:cs="Times New Roman" w:eastAsia="Times New Roman" w:hAnsi="Times New Roman"/>
-          <w:sz w:val="25"/>
-          <w:szCs w:val="25"/>
-          <w:rtl w:val="0"/>
-        </w:rPr>
-        <w:t xml:space="preserve">…………….</w:t>
-      </w:r>
-      <w:r>
-        <w:rPr>
-          <w:rFonts w:ascii="Times New Roman" w:cs="Times New Roman" w:eastAsia="Times New Roman" w:hAnsi="Times New Roman"/>
-          <w:color w:val="000000"/>
-          <w:sz w:val="25"/>
-          <w:szCs w:val="25"/>
-          <w:rtl w:val="0"/>
-        </w:rPr>
-        <w:t xml:space="preserve">đến ngày</w:t>
-      </w:r>
-      <w:r>
-        <w:rPr>
-          <w:rFonts w:ascii="Times New Roman" w:cs="Times New Roman" w:eastAsia="Times New Roman" w:hAnsi="Times New Roman"/>
-          <w:sz w:val="25"/>
-          <w:szCs w:val="25"/>
-          <w:rtl w:val="0"/>
-        </w:rPr>
-        <w:t xml:space="preserve">………..</w:t>
+        <w:t xml:space="preserve">Điều 3: Thời hạn thuê ${leaseDurationMonths} tháng, từ ngày ${startDate} đến ngày ${endDate}</w:t>
+      </w:r>
+      <w:r>
+        <w:rPr>
+          <w:rFonts w:ascii="Times New Roman" w:cs="Times New Roman" w:eastAsia="Times New Roman" w:hAnsi="Times New Roman"/>
+          <w:b w:val="1"/>
+          <w:bCs w:val="1"/>
+          <w:color w:val="000000"/>
+          <w:sz w:val="25"/>
+          <w:szCs w:val="25"/>
+          <w:rtl w:val="0"/>
+        </w:rPr>
+        <w:t xml:space="preserve"/>
+      </w:r>
+      <w:r>
+        <w:rPr>
+          <w:rFonts w:ascii="Times New Roman" w:cs="Times New Roman" w:eastAsia="Times New Roman" w:hAnsi="Times New Roman"/>
+          <w:color w:val="000000"/>
+          <w:sz w:val="25"/>
+          <w:szCs w:val="25"/>
+          <w:rtl w:val="0"/>
+        </w:rPr>
+        <w:t xml:space="preserve"/>
+      </w:r>
+      <w:r>
+        <w:rPr>
+          <w:rFonts w:ascii="Times New Roman" w:cs="Times New Roman" w:eastAsia="Times New Roman" w:hAnsi="Times New Roman"/>
+          <w:sz w:val="25"/>
+          <w:szCs w:val="25"/>
+          <w:rtl w:val="0"/>
+        </w:rPr>
+        <w:t xml:space="preserve"/>
+      </w:r>
+      <w:r>
+        <w:rPr>
+          <w:rFonts w:ascii="Times New Roman" w:cs="Times New Roman" w:eastAsia="Times New Roman" w:hAnsi="Times New Roman"/>
+          <w:color w:val="000000"/>
+          <w:sz w:val="25"/>
+          <w:szCs w:val="25"/>
+          <w:rtl w:val="0"/>
+        </w:rPr>
+        <w:t xml:space="preserve"/>
+      </w:r>
+      <w:r>
+        <w:rPr>
+          <w:rFonts w:ascii="Times New Roman" w:cs="Times New Roman" w:eastAsia="Times New Roman" w:hAnsi="Times New Roman"/>
+          <w:sz w:val="25"/>
+          <w:szCs w:val="25"/>
+          <w:rtl w:val="0"/>
+        </w:rPr>
+        <w:t xml:space="preserve"/>
+      </w:r>
+      <w:r>
+        <w:rPr>
+          <w:rFonts w:ascii="Times New Roman" w:cs="Times New Roman" w:eastAsia="Times New Roman" w:hAnsi="Times New Roman"/>
+          <w:color w:val="000000"/>
+          <w:sz w:val="25"/>
+          <w:szCs w:val="25"/>
+          <w:rtl w:val="0"/>
+        </w:rPr>
+        <w:t xml:space="preserve"/>
+      </w:r>
+      <w:r>
+        <w:rPr>
+          <w:rFonts w:ascii="Times New Roman" w:cs="Times New Roman" w:eastAsia="Times New Roman" w:hAnsi="Times New Roman"/>
+          <w:sz w:val="25"/>
+          <w:szCs w:val="25"/>
+          <w:rtl w:val="0"/>
+        </w:rPr>
+        <w:t xml:space="preserve"/>
       </w:r>
       <w:r>
         <w:rPr>
@@ -1481,18 +1481,18 @@
           <w:szCs w:val="25"/>
           <w:rtl w:val="0"/>
         </w:rPr>
-        <w:t xml:space="preserve">4.1. Tiền thuê nhà mỗi tháng là: </w:t>
-      </w:r>
-      <w:r>
-        <w:rPr>
-          <w:rFonts w:ascii="Times New Roman" w:cs="Times New Roman" w:eastAsia="Times New Roman" w:hAnsi="Times New Roman"/>
-          <w:b w:val="1"/>
-          <w:bCs w:val="1"/>
-          <w:sz w:val="25"/>
-          <w:szCs w:val="25"/>
-          <w:rtl w:val="0"/>
-        </w:rPr>
-        <w:t xml:space="preserve">…………………………………………….</w:t>
+        <w:t xml:space="preserve">4.1. Tiền thuê nhà mỗi tháng là: ${rentAmount} VND (Bằng chữ: ${rentAmountInWords})</w:t>
+      </w:r>
+      <w:r>
+        <w:rPr>
+          <w:rFonts w:ascii="Times New Roman" w:cs="Times New Roman" w:eastAsia="Times New Roman" w:hAnsi="Times New Roman"/>
+          <w:b w:val="1"/>
+          <w:bCs w:val="1"/>
+          <w:sz w:val="25"/>
+          <w:szCs w:val="25"/>
+          <w:rtl w:val="0"/>
+        </w:rPr>
+        <w:t xml:space="preserve"/>
       </w:r>
       <w:r>
         <w:rPr>
@@ -1617,56 +1617,56 @@
           <w:szCs w:val="25"/>
           <w:rtl w:val="0"/>
         </w:rPr>
-        <w:t xml:space="preserve">5.1 Đặt cọc: Bên B đặt cọc cho bên A một khoản tiền là: </w:t>
-      </w:r>
-      <w:r>
-        <w:rPr>
-          <w:rFonts w:ascii="Times New Roman" w:cs="Times New Roman" w:eastAsia="Times New Roman" w:hAnsi="Times New Roman"/>
-          <w:b w:val="1"/>
-          <w:bCs w:val="1"/>
-          <w:sz w:val="25"/>
-          <w:szCs w:val="25"/>
-          <w:rtl w:val="0"/>
-        </w:rPr>
-        <w:t xml:space="preserve">……………………………………</w:t>
-      </w:r>
-    </w:p>
-    <w:p>
-      <w:pPr>
-        <w:shd w:fill="ffffff" w:val="clear"/>
-        <w:spacing w:after="0" w:line="240" w:lineRule="auto"/>
-        <w:jc w:val="both"/>
-        <w:rPr>
-          <w:rFonts w:ascii="Times New Roman" w:cs="Times New Roman" w:eastAsia="Times New Roman" w:hAnsi="Times New Roman"/>
-          <w:b w:val="1"/>
-          <w:bCs w:val="1"/>
-          <w:color w:val="000000"/>
-          <w:sz w:val="25"/>
-          <w:szCs w:val="25"/>
-        </w:rPr>
-      </w:pPr>
-      <w:r>
-        <w:rPr>
-          <w:rFonts w:ascii="Times New Roman" w:cs="Times New Roman" w:eastAsia="Times New Roman" w:hAnsi="Times New Roman"/>
-          <w:b w:val="1"/>
-          <w:bCs w:val="1"/>
-          <w:sz w:val="25"/>
-          <w:szCs w:val="25"/>
-          <w:rtl w:val="0"/>
-        </w:rPr>
-        <w:t xml:space="preserve">……………………………………………………………………………………</w:t>
-      </w:r>
-      <w:r>
-        <w:rPr>
-          <w:rFonts w:ascii="Times New Roman" w:cs="Times New Roman" w:eastAsia="Times New Roman" w:hAnsi="Times New Roman"/>
-          <w:b w:val="1"/>
-          <w:bCs w:val="1"/>
-          <w:color w:val="000000"/>
-          <w:sz w:val="25"/>
-          <w:szCs w:val="25"/>
-          <w:rtl w:val="0"/>
-        </w:rPr>
-        <w:t xml:space="preserve">.</w:t>
+        <w:t xml:space="preserve">5.1 Đặt cọc: Bên B đặt cọc cho bên A một khoản tiền là: ${deposit} VND (Bằng chữ: ${depositInWords})</w:t>
+      </w:r>
+      <w:r>
+        <w:rPr>
+          <w:rFonts w:ascii="Times New Roman" w:cs="Times New Roman" w:eastAsia="Times New Roman" w:hAnsi="Times New Roman"/>
+          <w:b w:val="1"/>
+          <w:bCs w:val="1"/>
+          <w:sz w:val="25"/>
+          <w:szCs w:val="25"/>
+          <w:rtl w:val="0"/>
+        </w:rPr>
+        <w:t xml:space="preserve"/>
+      </w:r>
+    </w:p>
+    <w:p>
+      <w:pPr>
+        <w:shd w:fill="ffffff" w:val="clear"/>
+        <w:spacing w:after="0" w:line="240" w:lineRule="auto"/>
+        <w:jc w:val="both"/>
+        <w:rPr>
+          <w:rFonts w:ascii="Times New Roman" w:cs="Times New Roman" w:eastAsia="Times New Roman" w:hAnsi="Times New Roman"/>
+          <w:b w:val="1"/>
+          <w:bCs w:val="1"/>
+          <w:color w:val="000000"/>
+          <w:sz w:val="25"/>
+          <w:szCs w:val="25"/>
+        </w:rPr>
+      </w:pPr>
+      <w:r>
+        <w:rPr>
+          <w:rFonts w:ascii="Times New Roman" w:cs="Times New Roman" w:eastAsia="Times New Roman" w:hAnsi="Times New Roman"/>
+          <w:b w:val="1"/>
+          <w:bCs w:val="1"/>
+          <w:sz w:val="25"/>
+          <w:szCs w:val="25"/>
+          <w:rtl w:val="0"/>
+        </w:rPr>
+        <w:t xml:space="preserve"/>
+      </w:r>
+      <w:r>
+        <w:rPr>
+          <w:rFonts w:ascii="Times New Roman" w:cs="Times New Roman" w:eastAsia="Times New Roman" w:hAnsi="Times New Roman"/>
+          <w:b w:val="1"/>
+          <w:bCs w:val="1"/>
+          <w:color w:val="000000"/>
+          <w:sz w:val="25"/>
+          <w:szCs w:val="25"/>
+          <w:rtl w:val="0"/>
+        </w:rPr>
+        <w:t xml:space="preserve"/>
       </w:r>
     </w:p>
     <w:p>
@@ -1747,7 +1747,7 @@
           <w:szCs w:val="25"/>
           <w:rtl w:val="0"/>
         </w:rPr>
-        <w:t xml:space="preserve">……………………………………….</w:t>
+        <w:t xml:space="preserve"/>
       </w:r>
       <w:r>
         <w:rPr>
@@ -1789,7 +1789,7 @@
           <w:szCs w:val="25"/>
           <w:rtl w:val="0"/>
         </w:rPr>
-        <w:t xml:space="preserve">……………………………………………..</w:t>
+        <w:t xml:space="preserve"/>
       </w:r>
       <w:r>
         <w:rPr>
@@ -1830,7 +1830,7 @@
           <w:szCs w:val="25"/>
           <w:rtl w:val="0"/>
         </w:rPr>
-        <w:t xml:space="preserve">…………………………………………………..</w:t>
+        <w:t xml:space="preserve"/>
       </w:r>
       <w:r>
         <w:rPr>
@@ -1925,18 +1925,18 @@
           <w:szCs w:val="25"/>
           <w:rtl w:val="0"/>
         </w:rPr>
-        <w:t xml:space="preserve">Ngay khi ký kết hợp đồng, Bên B sẽ thanh toán thêm cho Bên A số tiền đặt cọc: </w:t>
-      </w:r>
-      <w:r>
-        <w:rPr>
-          <w:rFonts w:ascii="Times New Roman" w:cs="Times New Roman" w:eastAsia="Times New Roman" w:hAnsi="Times New Roman"/>
-          <w:b w:val="1"/>
-          <w:bCs w:val="1"/>
-          <w:sz w:val="25"/>
-          <w:szCs w:val="25"/>
-          <w:rtl w:val="0"/>
-        </w:rPr>
-        <w:t xml:space="preserve">………………………………………………………………………………………………</w:t>
+        <w:t xml:space="preserve">Ngay khi ký kết hợp đồng, Bên B sẽ thanh toán thêm cho Bên A số tiền đặt cọc: ${deposit} VND</w:t>
+      </w:r>
+      <w:r>
+        <w:rPr>
+          <w:rFonts w:ascii="Times New Roman" w:cs="Times New Roman" w:eastAsia="Times New Roman" w:hAnsi="Times New Roman"/>
+          <w:b w:val="1"/>
+          <w:bCs w:val="1"/>
+          <w:sz w:val="25"/>
+          <w:szCs w:val="25"/>
+          <w:rtl w:val="0"/>
+        </w:rPr>
+        <w:t xml:space="preserve"/>
       </w:r>
       <w:r>
         <w:rPr>
@@ -1976,45 +1976,45 @@
           <w:szCs w:val="25"/>
           <w:rtl w:val="0"/>
         </w:rPr>
-        <w:t xml:space="preserve">……………………</w:t>
-      </w:r>
-    </w:p>
-    <w:p>
-      <w:pPr>
-        <w:shd w:fill="ffffff" w:val="clear"/>
-        <w:spacing w:after="0" w:line="240" w:lineRule="auto"/>
-        <w:jc w:val="both"/>
-        <w:rPr>
-          <w:rFonts w:ascii="Times New Roman" w:cs="Times New Roman" w:eastAsia="Times New Roman" w:hAnsi="Times New Roman"/>
-          <w:b w:val="1"/>
-          <w:bCs w:val="1"/>
-          <w:color w:val="000000"/>
-          <w:sz w:val="25"/>
-          <w:szCs w:val="25"/>
-        </w:rPr>
-      </w:pPr>
-      <w:r>
-        <w:rPr>
-          <w:rFonts w:ascii="Times New Roman" w:cs="Times New Roman" w:eastAsia="Times New Roman" w:hAnsi="Times New Roman"/>
-          <w:b w:val="1"/>
-          <w:bCs w:val="1"/>
-          <w:sz w:val="25"/>
-          <w:szCs w:val="25"/>
-          <w:rtl w:val="0"/>
-        </w:rPr>
-        <w:t xml:space="preserve">……………………………………………………………………………………</w:t>
-      </w:r>
-      <w:r>
-        <w:rPr>
-          <w:rFonts w:ascii="Times New Roman" w:cs="Times New Roman" w:eastAsia="Times New Roman" w:hAnsi="Times New Roman"/>
-          <w:b w:val="1"/>
-          <w:bCs w:val="1"/>
-          <w:color w:val="000000"/>
-          <w:sz w:val="25"/>
-          <w:szCs w:val="25"/>
-          <w:rtl w:val="0"/>
-        </w:rPr>
-        <w:t xml:space="preserve">.</w:t>
+        <w:t xml:space="preserve"/>
+      </w:r>
+    </w:p>
+    <w:p>
+      <w:pPr>
+        <w:shd w:fill="ffffff" w:val="clear"/>
+        <w:spacing w:after="0" w:line="240" w:lineRule="auto"/>
+        <w:jc w:val="both"/>
+        <w:rPr>
+          <w:rFonts w:ascii="Times New Roman" w:cs="Times New Roman" w:eastAsia="Times New Roman" w:hAnsi="Times New Roman"/>
+          <w:b w:val="1"/>
+          <w:bCs w:val="1"/>
+          <w:color w:val="000000"/>
+          <w:sz w:val="25"/>
+          <w:szCs w:val="25"/>
+        </w:rPr>
+      </w:pPr>
+      <w:r>
+        <w:rPr>
+          <w:rFonts w:ascii="Times New Roman" w:cs="Times New Roman" w:eastAsia="Times New Roman" w:hAnsi="Times New Roman"/>
+          <w:b w:val="1"/>
+          <w:bCs w:val="1"/>
+          <w:sz w:val="25"/>
+          <w:szCs w:val="25"/>
+          <w:rtl w:val="0"/>
+        </w:rPr>
+        <w:t xml:space="preserve"/>
+      </w:r>
+      <w:r>
+        <w:rPr>
+          <w:rFonts w:ascii="Times New Roman" w:cs="Times New Roman" w:eastAsia="Times New Roman" w:hAnsi="Times New Roman"/>
+          <w:b w:val="1"/>
+          <w:bCs w:val="1"/>
+          <w:color w:val="000000"/>
+          <w:sz w:val="25"/>
+          <w:szCs w:val="25"/>
+          <w:rtl w:val="0"/>
+        </w:rPr>
+        <w:t xml:space="preserve"/>
       </w:r>
     </w:p>
     <w:p>
@@ -2232,18 +2232,18 @@
           <w:szCs w:val="25"/>
           <w:rtl w:val="0"/>
         </w:rPr>
-        <w:t xml:space="preserve">6.4. Bàn giao căn hộ và thiết bị cho thuê, công tơ điện, nước của căn hộ cho thuê đúng ngày theo thỏa thuận. Nội thất có thêm: </w:t>
-      </w:r>
-      <w:r>
-        <w:rPr>
-          <w:rFonts w:ascii="Times New Roman" w:cs="Times New Roman" w:eastAsia="Times New Roman" w:hAnsi="Times New Roman"/>
-          <w:b w:val="1"/>
-          <w:bCs w:val="1"/>
-          <w:sz w:val="25"/>
-          <w:szCs w:val="25"/>
-          <w:rtl w:val="0"/>
-        </w:rPr>
-        <w:t xml:space="preserve">…………………………………………………………</w:t>
+        <w:t xml:space="preserve">6.4. Bàn giao căn hộ và thiết bị cho thuê, công tơ điện, nước của căn hộ cho thuê đúng ngày theo thỏa thuận. Nội thất có thêm: ${equipmentSnapshot} </w:t>
+      </w:r>
+      <w:r>
+        <w:rPr>
+          <w:rFonts w:ascii="Times New Roman" w:cs="Times New Roman" w:eastAsia="Times New Roman" w:hAnsi="Times New Roman"/>
+          <w:b w:val="1"/>
+          <w:bCs w:val="1"/>
+          <w:sz w:val="25"/>
+          <w:szCs w:val="25"/>
+          <w:rtl w:val="0"/>
+        </w:rPr>
+        <w:t xml:space="preserve"/>
       </w:r>
     </w:p>
     <w:p>
@@ -2269,7 +2269,7 @@
           <w:szCs w:val="25"/>
           <w:rtl w:val="0"/>
         </w:rPr>
-        <w:t xml:space="preserve">……………………………………………………………………………………..</w:t>
+        <w:t xml:space="preserve"/>
       </w:r>
     </w:p>
     <w:p>
@@ -2294,7 +2294,7 @@
           <w:szCs w:val="25"/>
           <w:rtl w:val="0"/>
         </w:rPr>
-        <w:t xml:space="preserve">……………………………………………………………………………………</w:t>
+        <w:t xml:space="preserve"/>
       </w:r>
       <w:r>
         <w:rPr>
@@ -3218,7 +3218,7 @@
                 <w:szCs w:val="25"/>
                 <w:rtl w:val="0"/>
               </w:rPr>
-              <w:t xml:space="preserve"> </w:t>
+              <w:t xml:space="preserve"/>
             </w:r>
           </w:p>
         </w:tc>

</xml_diff>